<commit_message>
PM review styling updates-1
PM review styling updates-1
</commit_message>
<xml_diff>
--- a/_dev/Feedback/Internal/Observations_BTS BD Sim_SV_19-Oct 2026.docx
+++ b/_dev/Feedback/Internal/Observations_BTS BD Sim_SV_19-Oct 2026.docx
@@ -32,16 +32,24 @@
         </w:rPr>
         <w:t>aligned.</w:t>
       </w:r>
-    </w:p>
-    <w:p>
-      <w:pPr>
-        <w:spacing w:after="0"/>
-        <w:rPr>
-          <w:lang w:val="en-US"/>
-        </w:rPr>
-      </w:pPr>
-      <w:r>
-        <w:rPr>
+      <w:r>
+        <w:rPr>
+          <w:highlight w:val="green"/>
+          <w:lang w:val="en-US"/>
+        </w:rPr>
+        <w:t>Done</w:t>
+      </w:r>
+    </w:p>
+    <w:p>
+      <w:pPr>
+        <w:spacing w:after="0"/>
+        <w:rPr>
+          <w:lang w:val="en-US"/>
+        </w:rPr>
+      </w:pPr>
+      <w:r>
+        <w:rPr>
+          <w:noProof/>
           <w:lang w:val="en-US"/>
         </w:rPr>
         <w:drawing>
@@ -123,16 +131,30 @@
         </w:rPr>
         <w:t>, and there is a weird line there.</w:t>
       </w:r>
-    </w:p>
-    <w:p>
-      <w:pPr>
-        <w:spacing w:after="0"/>
-        <w:rPr>
-          <w:lang w:val="en-US"/>
-        </w:rPr>
-      </w:pPr>
-      <w:r>
-        <w:rPr>
+      <w:r>
+        <w:rPr>
+          <w:lang w:val="en-US"/>
+        </w:rPr>
+        <w:t xml:space="preserve"> </w:t>
+      </w:r>
+      <w:r>
+        <w:rPr>
+          <w:highlight w:val="green"/>
+          <w:lang w:val="en-US"/>
+        </w:rPr>
+        <w:t>Done</w:t>
+      </w:r>
+    </w:p>
+    <w:p>
+      <w:pPr>
+        <w:spacing w:after="0"/>
+        <w:rPr>
+          <w:lang w:val="en-US"/>
+        </w:rPr>
+      </w:pPr>
+      <w:r>
+        <w:rPr>
+          <w:noProof/>
           <w:lang w:val="en-US"/>
         </w:rPr>
         <w:drawing>
@@ -217,6 +239,7 @@
       </w:pPr>
       <w:r>
         <w:rPr>
+          <w:noProof/>
           <w:lang w:val="en-US"/>
         </w:rPr>
         <w:drawing>
@@ -291,24 +314,38 @@
         <w:lastRenderedPageBreak/>
         <w:t>Please fix team name screen for F login.</w:t>
       </w:r>
-    </w:p>
-    <w:p>
-      <w:pPr>
-        <w:spacing w:after="0"/>
-        <w:rPr>
-          <w:lang w:val="en-US"/>
-        </w:rPr>
-      </w:pPr>
-    </w:p>
-    <w:p>
-      <w:pPr>
-        <w:spacing w:after="0"/>
-        <w:rPr>
-          <w:lang w:val="en-US"/>
-        </w:rPr>
-      </w:pPr>
-      <w:r>
-        <w:rPr>
+      <w:r>
+        <w:rPr>
+          <w:lang w:val="en-US"/>
+        </w:rPr>
+        <w:t xml:space="preserve"> </w:t>
+      </w:r>
+      <w:r>
+        <w:rPr>
+          <w:highlight w:val="green"/>
+          <w:lang w:val="en-US"/>
+        </w:rPr>
+        <w:t>Done</w:t>
+      </w:r>
+    </w:p>
+    <w:p>
+      <w:pPr>
+        <w:spacing w:after="0"/>
+        <w:rPr>
+          <w:lang w:val="en-US"/>
+        </w:rPr>
+      </w:pPr>
+    </w:p>
+    <w:p>
+      <w:pPr>
+        <w:spacing w:after="0"/>
+        <w:rPr>
+          <w:lang w:val="en-US"/>
+        </w:rPr>
+      </w:pPr>
+      <w:r>
+        <w:rPr>
+          <w:noProof/>
           <w:lang w:val="en-US"/>
         </w:rPr>
         <w:drawing>
@@ -388,6 +425,13 @@
         <w:lastRenderedPageBreak/>
         <w:t>Is this faded effect intentional?</w:t>
       </w:r>
+      <w:r>
+        <w:rPr>
+          <w:highlight w:val="green"/>
+          <w:lang w:val="en-US"/>
+        </w:rPr>
+        <w:t>Done</w:t>
+      </w:r>
     </w:p>
     <w:p>
       <w:pPr>
@@ -424,21 +468,7 @@
         <w:rPr>
           <w:lang w:val="en-US"/>
         </w:rPr>
-        <w:t xml:space="preserve">I understand the sim is BTS branded, but we could have still avoided these wave </w:t>
-      </w:r>
-      <w:proofErr w:type="gramStart"/>
-      <w:r>
-        <w:rPr>
-          <w:lang w:val="en-US"/>
-        </w:rPr>
-        <w:t>effect</w:t>
-      </w:r>
-      <w:proofErr w:type="gramEnd"/>
-      <w:r>
-        <w:rPr>
-          <w:lang w:val="en-US"/>
-        </w:rPr>
-        <w:t xml:space="preserve"> and used something else. </w:t>
+        <w:t xml:space="preserve">I understand the sim is BTS branded, but we could have still avoided these wave effect and used something else. </w:t>
       </w:r>
     </w:p>
     <w:p>
@@ -453,54 +483,27 @@
         <w:rPr>
           <w:lang w:val="en-US"/>
         </w:rPr>
-        <w:t xml:space="preserve">All </w:t>
-      </w:r>
-      <w:proofErr w:type="gramStart"/>
-      <w:r>
-        <w:rPr>
-          <w:lang w:val="en-US"/>
-        </w:rPr>
-        <w:t>bigshots</w:t>
-      </w:r>
-      <w:proofErr w:type="gramEnd"/>
-      <w:r>
-        <w:rPr>
-          <w:lang w:val="en-US"/>
-        </w:rPr>
-        <w:t xml:space="preserve"> (including Jessica Skon) </w:t>
-      </w:r>
-      <w:proofErr w:type="gramStart"/>
-      <w:r>
-        <w:rPr>
-          <w:lang w:val="en-US"/>
-        </w:rPr>
-        <w:t>is</w:t>
-      </w:r>
-      <w:proofErr w:type="gramEnd"/>
-      <w:r>
-        <w:rPr>
-          <w:lang w:val="en-US"/>
-        </w:rPr>
-        <w:t xml:space="preserve"> going to be part of these deliveries. Let’s put in a little more effort to make it look better.</w:t>
-      </w:r>
-    </w:p>
-    <w:p>
-      <w:pPr>
-        <w:spacing w:after="0"/>
-        <w:rPr>
-          <w:lang w:val="en-US"/>
-        </w:rPr>
-      </w:pPr>
-    </w:p>
-    <w:p>
-      <w:pPr>
-        <w:spacing w:after="0"/>
-        <w:rPr>
-          <w:lang w:val="en-US"/>
-        </w:rPr>
-      </w:pPr>
-      <w:r>
-        <w:rPr>
+        <w:t>All bigshots (including Jessica Skon) is going to be part of these deliveries. Let’s put in a little more effort to make it look better.</w:t>
+      </w:r>
+    </w:p>
+    <w:p>
+      <w:pPr>
+        <w:spacing w:after="0"/>
+        <w:rPr>
+          <w:lang w:val="en-US"/>
+        </w:rPr>
+      </w:pPr>
+    </w:p>
+    <w:p>
+      <w:pPr>
+        <w:spacing w:after="0"/>
+        <w:rPr>
+          <w:lang w:val="en-US"/>
+        </w:rPr>
+      </w:pPr>
+      <w:r>
+        <w:rPr>
+          <w:noProof/>
           <w:lang w:val="en-US"/>
         </w:rPr>
         <w:drawing>
@@ -568,39 +571,53 @@
           <w:lang w:val="en-US"/>
         </w:rPr>
       </w:pPr>
-      <w:proofErr w:type="gramStart"/>
       <w:r>
         <w:rPr>
           <w:lang w:val="en-US"/>
         </w:rPr>
         <w:lastRenderedPageBreak/>
-        <w:t>Again</w:t>
-      </w:r>
-      <w:proofErr w:type="gramEnd"/>
-      <w:r>
-        <w:rPr>
-          <w:lang w:val="en-US"/>
-        </w:rPr>
-        <w:t xml:space="preserve"> faded effect in the bottom does not look very appealing. The screen looks too bland.</w:t>
-      </w:r>
-    </w:p>
-    <w:p>
-      <w:pPr>
-        <w:spacing w:after="0"/>
-        <w:rPr>
-          <w:lang w:val="en-US"/>
-        </w:rPr>
-      </w:pPr>
-    </w:p>
-    <w:p>
-      <w:pPr>
-        <w:spacing w:after="0"/>
-        <w:rPr>
-          <w:lang w:val="en-US"/>
-        </w:rPr>
-      </w:pPr>
-      <w:r>
-        <w:rPr>
+        <w:t xml:space="preserve">Again faded effect in the bottom does not look very appealing. </w:t>
+      </w:r>
+      <w:r>
+        <w:rPr>
+          <w:highlight w:val="green"/>
+          <w:lang w:val="en-US"/>
+        </w:rPr>
+        <w:t>Done</w:t>
+      </w:r>
+    </w:p>
+    <w:p>
+      <w:pPr>
+        <w:spacing w:after="0"/>
+        <w:rPr>
+          <w:lang w:val="en-US"/>
+        </w:rPr>
+      </w:pPr>
+      <w:r>
+        <w:rPr>
+          <w:lang w:val="en-US"/>
+        </w:rPr>
+        <w:t>The screen looks too bland.</w:t>
+      </w:r>
+    </w:p>
+    <w:p>
+      <w:pPr>
+        <w:spacing w:after="0"/>
+        <w:rPr>
+          <w:lang w:val="en-US"/>
+        </w:rPr>
+      </w:pPr>
+    </w:p>
+    <w:p>
+      <w:pPr>
+        <w:spacing w:after="0"/>
+        <w:rPr>
+          <w:lang w:val="en-US"/>
+        </w:rPr>
+      </w:pPr>
+      <w:r>
+        <w:rPr>
+          <w:noProof/>
           <w:lang w:val="en-US"/>
         </w:rPr>
         <w:drawing>
@@ -717,6 +734,7 @@
       </w:pPr>
       <w:r>
         <w:rPr>
+          <w:noProof/>
           <w:lang w:val="en-US"/>
         </w:rPr>
         <w:drawing>
@@ -789,32 +807,32 @@
           <w:lang w:val="en-US"/>
         </w:rPr>
         <w:lastRenderedPageBreak/>
-        <w:t xml:space="preserve">Font </w:t>
-      </w:r>
-      <w:proofErr w:type="spellStart"/>
-      <w:r>
-        <w:rPr>
-          <w:lang w:val="en-US"/>
-        </w:rPr>
-        <w:t>colour</w:t>
-      </w:r>
-      <w:proofErr w:type="spellEnd"/>
-      <w:r>
-        <w:rPr>
-          <w:lang w:val="en-US"/>
-        </w:rPr>
-        <w:t xml:space="preserve"> of F login is too light.</w:t>
-      </w:r>
-    </w:p>
-    <w:p>
-      <w:pPr>
-        <w:spacing w:after="0"/>
-        <w:rPr>
-          <w:lang w:val="en-US"/>
-        </w:rPr>
-      </w:pPr>
-      <w:r>
-        <w:rPr>
+        <w:t>Font colour of F login is too light.</w:t>
+      </w:r>
+      <w:r>
+        <w:rPr>
+          <w:lang w:val="en-US"/>
+        </w:rPr>
+        <w:t xml:space="preserve"> </w:t>
+      </w:r>
+      <w:r>
+        <w:rPr>
+          <w:highlight w:val="green"/>
+          <w:lang w:val="en-US"/>
+        </w:rPr>
+        <w:t>Done</w:t>
+      </w:r>
+    </w:p>
+    <w:p>
+      <w:pPr>
+        <w:spacing w:after="0"/>
+        <w:rPr>
+          <w:lang w:val="en-US"/>
+        </w:rPr>
+      </w:pPr>
+      <w:r>
+        <w:rPr>
+          <w:noProof/>
           <w:lang w:val="en-US"/>
         </w:rPr>
         <w:drawing>
@@ -889,24 +907,30 @@
         <w:lastRenderedPageBreak/>
         <w:t>Please fix this.</w:t>
       </w:r>
-    </w:p>
-    <w:p>
-      <w:pPr>
-        <w:spacing w:after="0"/>
-        <w:rPr>
-          <w:lang w:val="en-US"/>
-        </w:rPr>
-      </w:pPr>
-    </w:p>
-    <w:p>
-      <w:pPr>
-        <w:spacing w:after="0"/>
-        <w:rPr>
-          <w:lang w:val="en-US"/>
-        </w:rPr>
-      </w:pPr>
-      <w:r>
-        <w:rPr>
+      <w:r>
+        <w:rPr>
+          <w:lang w:val="en-US"/>
+        </w:rPr>
+        <w:t xml:space="preserve"> </w:t>
+      </w:r>
+      <w:r>
+        <w:rPr>
+          <w:highlight w:val="green"/>
+          <w:lang w:val="en-US"/>
+        </w:rPr>
+        <w:t>Done</w:t>
+      </w:r>
+    </w:p>
+    <w:p>
+      <w:pPr>
+        <w:spacing w:after="0"/>
+        <w:rPr>
+          <w:lang w:val="en-US"/>
+        </w:rPr>
+      </w:pPr>
+      <w:r>
+        <w:rPr>
+          <w:noProof/>
           <w:lang w:val="en-US"/>
         </w:rPr>
         <w:drawing>
@@ -1005,6 +1029,20 @@
         </w:rPr>
         <w:t>Numbers are too small to read.</w:t>
       </w:r>
+      <w:r>
+        <w:rPr>
+          <w:highlight w:val="green"/>
+          <w:lang w:val="en-US"/>
+        </w:rPr>
+        <w:t xml:space="preserve"> </w:t>
+      </w:r>
+      <w:r>
+        <w:rPr>
+          <w:highlight w:val="green"/>
+          <w:lang w:val="en-US"/>
+        </w:rPr>
+        <w:t>Done</w:t>
+      </w:r>
     </w:p>
     <w:p>
       <w:pPr>
@@ -1024,16 +1062,31 @@
         </w:rPr>
         <w:t>Numbers have been pushed too much in the corner. They could be centrally aligned within the column.</w:t>
       </w:r>
-    </w:p>
-    <w:p>
-      <w:pPr>
-        <w:spacing w:after="0"/>
-        <w:rPr>
-          <w:lang w:val="en-US"/>
-        </w:rPr>
-      </w:pPr>
-      <w:r>
-        <w:rPr>
+      <w:r>
+        <w:rPr>
+          <w:highlight w:val="green"/>
+          <w:lang w:val="en-US"/>
+        </w:rPr>
+        <w:t xml:space="preserve"> </w:t>
+      </w:r>
+      <w:r>
+        <w:rPr>
+          <w:highlight w:val="green"/>
+          <w:lang w:val="en-US"/>
+        </w:rPr>
+        <w:t>Done</w:t>
+      </w:r>
+    </w:p>
+    <w:p>
+      <w:pPr>
+        <w:spacing w:after="0"/>
+        <w:rPr>
+          <w:lang w:val="en-US"/>
+        </w:rPr>
+      </w:pPr>
+      <w:r>
+        <w:rPr>
+          <w:noProof/>
           <w:lang w:val="en-US"/>
         </w:rPr>
         <w:drawing>
@@ -1113,24 +1166,39 @@
         <w:lastRenderedPageBreak/>
         <w:t>Please make 0 in black font.</w:t>
       </w:r>
-    </w:p>
-    <w:p>
-      <w:pPr>
-        <w:spacing w:after="0"/>
-        <w:rPr>
-          <w:lang w:val="en-US"/>
-        </w:rPr>
-      </w:pPr>
-    </w:p>
-    <w:p>
-      <w:pPr>
-        <w:spacing w:after="0"/>
-        <w:rPr>
-          <w:lang w:val="en-US"/>
-        </w:rPr>
-      </w:pPr>
-      <w:r>
-        <w:rPr>
+      <w:r>
+        <w:rPr>
+          <w:highlight w:val="green"/>
+          <w:lang w:val="en-US"/>
+        </w:rPr>
+        <w:t xml:space="preserve"> </w:t>
+      </w:r>
+      <w:r>
+        <w:rPr>
+          <w:highlight w:val="green"/>
+          <w:lang w:val="en-US"/>
+        </w:rPr>
+        <w:t>Done</w:t>
+      </w:r>
+    </w:p>
+    <w:p>
+      <w:pPr>
+        <w:spacing w:after="0"/>
+        <w:rPr>
+          <w:lang w:val="en-US"/>
+        </w:rPr>
+      </w:pPr>
+    </w:p>
+    <w:p>
+      <w:pPr>
+        <w:spacing w:after="0"/>
+        <w:rPr>
+          <w:lang w:val="en-US"/>
+        </w:rPr>
+      </w:pPr>
+      <w:r>
+        <w:rPr>
+          <w:noProof/>
           <w:lang w:val="en-US"/>
         </w:rPr>
         <w:drawing>
@@ -1296,6 +1364,7 @@
       </w:pPr>
       <w:r>
         <w:rPr>
+          <w:noProof/>
           <w:lang w:val="en-US"/>
         </w:rPr>
         <w:drawing>
@@ -1375,6 +1444,19 @@
         <w:lastRenderedPageBreak/>
         <w:t>Give some space between text and bot area.</w:t>
       </w:r>
+      <w:r>
+        <w:rPr>
+          <w:lang w:val="en-US"/>
+        </w:rPr>
+        <w:t xml:space="preserve"> </w:t>
+      </w:r>
+      <w:r>
+        <w:rPr>
+          <w:highlight w:val="green"/>
+          <w:lang w:val="en-US"/>
+        </w:rPr>
+        <w:t>Done</w:t>
+      </w:r>
     </w:p>
     <w:p>
       <w:pPr>
@@ -1394,16 +1476,31 @@
         </w:rPr>
         <w:t>Borders are inconsistent.</w:t>
       </w:r>
-    </w:p>
-    <w:p>
-      <w:pPr>
-        <w:spacing w:after="0"/>
-        <w:rPr>
-          <w:lang w:val="en-US"/>
-        </w:rPr>
-      </w:pPr>
-      <w:r>
-        <w:rPr>
+      <w:r>
+        <w:rPr>
+          <w:highlight w:val="green"/>
+          <w:lang w:val="en-US"/>
+        </w:rPr>
+        <w:t xml:space="preserve"> </w:t>
+      </w:r>
+      <w:r>
+        <w:rPr>
+          <w:highlight w:val="green"/>
+          <w:lang w:val="en-US"/>
+        </w:rPr>
+        <w:t>Done</w:t>
+      </w:r>
+    </w:p>
+    <w:p>
+      <w:pPr>
+        <w:spacing w:after="0"/>
+        <w:rPr>
+          <w:lang w:val="en-US"/>
+        </w:rPr>
+      </w:pPr>
+      <w:r>
+        <w:rPr>
+          <w:noProof/>
           <w:lang w:val="en-US"/>
         </w:rPr>
         <w:drawing>
@@ -1496,6 +1593,7 @@
       </w:pPr>
       <w:r>
         <w:rPr>
+          <w:noProof/>
           <w:lang w:val="en-US"/>
         </w:rPr>
         <w:drawing>
@@ -1577,16 +1675,31 @@
         </w:rPr>
         <w:t>Fix F login.</w:t>
       </w:r>
-    </w:p>
-    <w:p>
-      <w:pPr>
-        <w:spacing w:after="0"/>
-        <w:rPr>
-          <w:lang w:val="en-US"/>
-        </w:rPr>
-      </w:pPr>
-      <w:r>
-        <w:rPr>
+      <w:r>
+        <w:rPr>
+          <w:highlight w:val="green"/>
+          <w:lang w:val="en-US"/>
+        </w:rPr>
+        <w:t xml:space="preserve"> </w:t>
+      </w:r>
+      <w:r>
+        <w:rPr>
+          <w:highlight w:val="green"/>
+          <w:lang w:val="en-US"/>
+        </w:rPr>
+        <w:t>Done</w:t>
+      </w:r>
+    </w:p>
+    <w:p>
+      <w:pPr>
+        <w:spacing w:after="0"/>
+        <w:rPr>
+          <w:lang w:val="en-US"/>
+        </w:rPr>
+      </w:pPr>
+      <w:r>
+        <w:rPr>
+          <w:noProof/>
           <w:lang w:val="en-US"/>
         </w:rPr>
         <w:drawing>
@@ -1666,21 +1779,7 @@
         <w:rPr>
           <w:lang w:val="en-US"/>
         </w:rPr>
-        <w:t xml:space="preserve">Add </w:t>
-      </w:r>
-      <w:proofErr w:type="spellStart"/>
-      <w:r>
-        <w:rPr>
-          <w:lang w:val="en-US"/>
-        </w:rPr>
-        <w:t>textlist</w:t>
-      </w:r>
-      <w:proofErr w:type="spellEnd"/>
-      <w:r>
-        <w:rPr>
-          <w:lang w:val="en-US"/>
-        </w:rPr>
-        <w:t xml:space="preserve"> results as well for BS.</w:t>
+        <w:t>Add textlist results as well for BS.</w:t>
       </w:r>
     </w:p>
     <w:p>
@@ -1718,24 +1817,39 @@
         <w:lastRenderedPageBreak/>
         <w:t>These overlap on hover.</w:t>
       </w:r>
-    </w:p>
-    <w:p>
-      <w:pPr>
-        <w:spacing w:after="0"/>
-        <w:rPr>
-          <w:lang w:val="en-US"/>
-        </w:rPr>
-      </w:pPr>
-    </w:p>
-    <w:p>
-      <w:pPr>
-        <w:spacing w:after="0"/>
-        <w:rPr>
-          <w:lang w:val="en-US"/>
-        </w:rPr>
-      </w:pPr>
-      <w:r>
-        <w:rPr>
+      <w:r>
+        <w:rPr>
+          <w:highlight w:val="green"/>
+          <w:lang w:val="en-US"/>
+        </w:rPr>
+        <w:t xml:space="preserve"> </w:t>
+      </w:r>
+      <w:r>
+        <w:rPr>
+          <w:highlight w:val="green"/>
+          <w:lang w:val="en-US"/>
+        </w:rPr>
+        <w:t>Done</w:t>
+      </w:r>
+    </w:p>
+    <w:p>
+      <w:pPr>
+        <w:spacing w:after="0"/>
+        <w:rPr>
+          <w:lang w:val="en-US"/>
+        </w:rPr>
+      </w:pPr>
+    </w:p>
+    <w:p>
+      <w:pPr>
+        <w:spacing w:after="0"/>
+        <w:rPr>
+          <w:lang w:val="en-US"/>
+        </w:rPr>
+      </w:pPr>
+      <w:r>
+        <w:rPr>
+          <w:noProof/>
           <w:lang w:val="en-US"/>
         </w:rPr>
         <w:drawing>
@@ -1810,24 +1924,38 @@
         <w:lastRenderedPageBreak/>
         <w:t>Can we fix column widths?</w:t>
       </w:r>
-    </w:p>
-    <w:p>
-      <w:pPr>
-        <w:spacing w:after="0"/>
-        <w:rPr>
-          <w:lang w:val="en-US"/>
-        </w:rPr>
-      </w:pPr>
-    </w:p>
-    <w:p>
-      <w:pPr>
-        <w:spacing w:after="0"/>
-        <w:rPr>
-          <w:lang w:val="en-US"/>
-        </w:rPr>
-      </w:pPr>
-      <w:r>
-        <w:rPr>
+      <w:r>
+        <w:rPr>
+          <w:lang w:val="en-US"/>
+        </w:rPr>
+        <w:t xml:space="preserve"> </w:t>
+      </w:r>
+      <w:r>
+        <w:rPr>
+          <w:highlight w:val="green"/>
+          <w:lang w:val="en-US"/>
+        </w:rPr>
+        <w:t>Done</w:t>
+      </w:r>
+    </w:p>
+    <w:p>
+      <w:pPr>
+        <w:spacing w:after="0"/>
+        <w:rPr>
+          <w:lang w:val="en-US"/>
+        </w:rPr>
+      </w:pPr>
+    </w:p>
+    <w:p>
+      <w:pPr>
+        <w:spacing w:after="0"/>
+        <w:rPr>
+          <w:lang w:val="en-US"/>
+        </w:rPr>
+      </w:pPr>
+      <w:r>
+        <w:rPr>
+          <w:noProof/>
           <w:lang w:val="en-US"/>
         </w:rPr>
         <w:drawing>
@@ -1907,6 +2035,20 @@
         <w:lastRenderedPageBreak/>
         <w:t>Centrally align numbers in reporter login.</w:t>
       </w:r>
+      <w:r>
+        <w:rPr>
+          <w:highlight w:val="green"/>
+          <w:lang w:val="en-US"/>
+        </w:rPr>
+        <w:t xml:space="preserve"> </w:t>
+      </w:r>
+      <w:r>
+        <w:rPr>
+          <w:highlight w:val="green"/>
+          <w:lang w:val="en-US"/>
+        </w:rPr>
+        <w:t>Done</w:t>
+      </w:r>
     </w:p>
     <w:p>
       <w:pPr>
@@ -1926,24 +2068,39 @@
         </w:rPr>
         <w:t>Is there an extra line/border around the table header?</w:t>
       </w:r>
-    </w:p>
-    <w:p>
-      <w:pPr>
-        <w:spacing w:after="0"/>
-        <w:rPr>
-          <w:lang w:val="en-US"/>
-        </w:rPr>
-      </w:pPr>
-    </w:p>
-    <w:p>
-      <w:pPr>
-        <w:spacing w:after="0"/>
-        <w:rPr>
-          <w:lang w:val="en-US"/>
-        </w:rPr>
-      </w:pPr>
-      <w:r>
-        <w:rPr>
+      <w:r>
+        <w:rPr>
+          <w:highlight w:val="green"/>
+          <w:lang w:val="en-US"/>
+        </w:rPr>
+        <w:t xml:space="preserve"> </w:t>
+      </w:r>
+      <w:r>
+        <w:rPr>
+          <w:highlight w:val="green"/>
+          <w:lang w:val="en-US"/>
+        </w:rPr>
+        <w:t>Done</w:t>
+      </w:r>
+    </w:p>
+    <w:p>
+      <w:pPr>
+        <w:spacing w:after="0"/>
+        <w:rPr>
+          <w:lang w:val="en-US"/>
+        </w:rPr>
+      </w:pPr>
+    </w:p>
+    <w:p>
+      <w:pPr>
+        <w:spacing w:after="0"/>
+        <w:rPr>
+          <w:lang w:val="en-US"/>
+        </w:rPr>
+      </w:pPr>
+      <w:r>
+        <w:rPr>
+          <w:noProof/>
           <w:lang w:val="en-US"/>
         </w:rPr>
         <w:drawing>
@@ -3313,7 +3470,6 @@
   <w:style w:type="character" w:default="1" w:styleId="DefaultParagraphFont">
     <w:name w:val="Default Paragraph Font"/>
     <w:uiPriority w:val="1"/>
-    <w:semiHidden/>
     <w:unhideWhenUsed/>
   </w:style>
   <w:style w:type="table" w:default="1" w:styleId="TableNormal">

</xml_diff>

<commit_message>
comments added in doc
</commit_message>
<xml_diff>
--- a/_dev/Feedback/Internal/Observations_BTS BD Sim_SV_19-Oct 2026.docx
+++ b/_dev/Feedback/Internal/Observations_BTS BD Sim_SV_19-Oct 2026.docx
@@ -26,6 +26,7 @@
         </w:rPr>
         <w:t xml:space="preserve">(vertically) </w:t>
       </w:r>
+      <w:proofErr w:type="spellStart"/>
       <w:r>
         <w:rPr>
           <w:lang w:val="en-US"/>
@@ -39,6 +40,7 @@
         </w:rPr>
         <w:t>Done</w:t>
       </w:r>
+      <w:proofErr w:type="spellEnd"/>
     </w:p>
     <w:p>
       <w:pPr>
@@ -229,6 +231,20 @@
         <w:lastRenderedPageBreak/>
         <w:t>Let’s remove this.</w:t>
       </w:r>
+      <w:r>
+        <w:rPr>
+          <w:highlight w:val="green"/>
+          <w:lang w:val="en-US"/>
+        </w:rPr>
+        <w:t xml:space="preserve"> </w:t>
+      </w:r>
+      <w:r>
+        <w:rPr>
+          <w:highlight w:val="green"/>
+          <w:lang w:val="en-US"/>
+        </w:rPr>
+        <w:t>Done</w:t>
+      </w:r>
     </w:p>
     <w:p>
       <w:pPr>
@@ -423,7 +439,14 @@
           <w:lang w:val="en-US"/>
         </w:rPr>
         <w:lastRenderedPageBreak/>
-        <w:t>Is this faded effect intentional?</w:t>
+        <w:t xml:space="preserve">Is this faded effect </w:t>
+      </w:r>
+      <w:proofErr w:type="spellStart"/>
+      <w:r>
+        <w:rPr>
+          <w:lang w:val="en-US"/>
+        </w:rPr>
+        <w:t>intentional?</w:t>
       </w:r>
       <w:r>
         <w:rPr>
@@ -432,6 +455,7 @@
         </w:rPr>
         <w:t>Done</w:t>
       </w:r>
+      <w:proofErr w:type="spellEnd"/>
     </w:p>
     <w:p>
       <w:pPr>
@@ -451,6 +475,20 @@
         </w:rPr>
         <w:t>Team Name screen is not accepting hyphens.</w:t>
       </w:r>
+      <w:r>
+        <w:rPr>
+          <w:highlight w:val="green"/>
+          <w:lang w:val="en-US"/>
+        </w:rPr>
+        <w:t xml:space="preserve"> </w:t>
+      </w:r>
+      <w:r>
+        <w:rPr>
+          <w:highlight w:val="green"/>
+          <w:lang w:val="en-US"/>
+        </w:rPr>
+        <w:t>Done</w:t>
+      </w:r>
     </w:p>
     <w:p>
       <w:pPr>
@@ -468,7 +506,21 @@
         <w:rPr>
           <w:lang w:val="en-US"/>
         </w:rPr>
-        <w:t xml:space="preserve">I understand the sim is BTS branded, but we could have still avoided these wave effect and used something else. </w:t>
+        <w:t xml:space="preserve">I understand the sim is BTS branded, but we could have still avoided these wave </w:t>
+      </w:r>
+      <w:proofErr w:type="gramStart"/>
+      <w:r>
+        <w:rPr>
+          <w:lang w:val="en-US"/>
+        </w:rPr>
+        <w:t>effect</w:t>
+      </w:r>
+      <w:proofErr w:type="gramEnd"/>
+      <w:r>
+        <w:rPr>
+          <w:lang w:val="en-US"/>
+        </w:rPr>
+        <w:t xml:space="preserve"> and used something else. </w:t>
       </w:r>
     </w:p>
     <w:p>
@@ -483,7 +535,35 @@
         <w:rPr>
           <w:lang w:val="en-US"/>
         </w:rPr>
-        <w:t>All bigshots (including Jessica Skon) is going to be part of these deliveries. Let’s put in a little more effort to make it look better.</w:t>
+        <w:t xml:space="preserve">All </w:t>
+      </w:r>
+      <w:proofErr w:type="gramStart"/>
+      <w:r>
+        <w:rPr>
+          <w:lang w:val="en-US"/>
+        </w:rPr>
+        <w:t>bigshots</w:t>
+      </w:r>
+      <w:proofErr w:type="gramEnd"/>
+      <w:r>
+        <w:rPr>
+          <w:lang w:val="en-US"/>
+        </w:rPr>
+        <w:t xml:space="preserve"> (including Jessica Skon) </w:t>
+      </w:r>
+      <w:proofErr w:type="gramStart"/>
+      <w:r>
+        <w:rPr>
+          <w:lang w:val="en-US"/>
+        </w:rPr>
+        <w:t>is</w:t>
+      </w:r>
+      <w:proofErr w:type="gramEnd"/>
+      <w:r>
+        <w:rPr>
+          <w:lang w:val="en-US"/>
+        </w:rPr>
+        <w:t xml:space="preserve"> going to be part of these deliveries. Let’s put in a little more effort to make it look better.</w:t>
       </w:r>
     </w:p>
     <w:p>
@@ -571,12 +651,20 @@
           <w:lang w:val="en-US"/>
         </w:rPr>
       </w:pPr>
+      <w:proofErr w:type="gramStart"/>
       <w:r>
         <w:rPr>
           <w:lang w:val="en-US"/>
         </w:rPr>
         <w:lastRenderedPageBreak/>
-        <w:t xml:space="preserve">Again faded effect in the bottom does not look very appealing. </w:t>
+        <w:t>Again</w:t>
+      </w:r>
+      <w:proofErr w:type="gramEnd"/>
+      <w:r>
+        <w:rPr>
+          <w:lang w:val="en-US"/>
+        </w:rPr>
+        <w:t xml:space="preserve"> faded effect in the bottom does not look very appealing. </w:t>
       </w:r>
       <w:r>
         <w:rPr>
@@ -807,7 +895,21 @@
           <w:lang w:val="en-US"/>
         </w:rPr>
         <w:lastRenderedPageBreak/>
-        <w:t>Font colour of F login is too light.</w:t>
+        <w:t xml:space="preserve">Font </w:t>
+      </w:r>
+      <w:proofErr w:type="spellStart"/>
+      <w:r>
+        <w:rPr>
+          <w:lang w:val="en-US"/>
+        </w:rPr>
+        <w:t>colour</w:t>
+      </w:r>
+      <w:proofErr w:type="spellEnd"/>
+      <w:r>
+        <w:rPr>
+          <w:lang w:val="en-US"/>
+        </w:rPr>
+        <w:t xml:space="preserve"> of F login is too light.</w:t>
       </w:r>
       <w:r>
         <w:rPr>
@@ -1297,6 +1399,20 @@
         </w:rPr>
         <w:t>Placeholder text can simply be “Enter text here.”</w:t>
       </w:r>
+      <w:r>
+        <w:rPr>
+          <w:highlight w:val="green"/>
+          <w:lang w:val="en-US"/>
+        </w:rPr>
+        <w:t xml:space="preserve"> </w:t>
+      </w:r>
+      <w:r>
+        <w:rPr>
+          <w:highlight w:val="green"/>
+          <w:lang w:val="en-US"/>
+        </w:rPr>
+        <w:t>Done</w:t>
+      </w:r>
     </w:p>
     <w:p>
       <w:pPr>
@@ -1316,6 +1432,20 @@
         </w:rPr>
         <w:t>Also, since it is multiple entries, we should add it as a separate tab.</w:t>
       </w:r>
+      <w:r>
+        <w:rPr>
+          <w:highlight w:val="green"/>
+          <w:lang w:val="en-US"/>
+        </w:rPr>
+        <w:t xml:space="preserve"> </w:t>
+      </w:r>
+      <w:r>
+        <w:rPr>
+          <w:highlight w:val="green"/>
+          <w:lang w:val="en-US"/>
+        </w:rPr>
+        <w:t>Done</w:t>
+      </w:r>
     </w:p>
     <w:p>
       <w:pPr>
@@ -1335,6 +1465,20 @@
         </w:rPr>
         <w:t>Show live data of only my team below.</w:t>
       </w:r>
+      <w:r>
+        <w:rPr>
+          <w:highlight w:val="green"/>
+          <w:lang w:val="en-US"/>
+        </w:rPr>
+        <w:t xml:space="preserve"> </w:t>
+      </w:r>
+      <w:r>
+        <w:rPr>
+          <w:highlight w:val="green"/>
+          <w:lang w:val="en-US"/>
+        </w:rPr>
+        <w:t>Done</w:t>
+      </w:r>
     </w:p>
     <w:p>
       <w:pPr>
@@ -1353,6 +1497,20 @@
           <w:lang w:val="en-US"/>
         </w:rPr>
         <w:t>If possible, show entries on F login as well.</w:t>
+      </w:r>
+      <w:r>
+        <w:rPr>
+          <w:highlight w:val="green"/>
+          <w:lang w:val="en-US"/>
+        </w:rPr>
+        <w:t xml:space="preserve"> </w:t>
+      </w:r>
+      <w:r>
+        <w:rPr>
+          <w:highlight w:val="green"/>
+          <w:lang w:val="en-US"/>
+        </w:rPr>
+        <w:t>Done</w:t>
       </w:r>
     </w:p>
     <w:p>
@@ -1575,6 +1733,20 @@
         <w:lastRenderedPageBreak/>
         <w:t>This should be underlined as well.</w:t>
       </w:r>
+      <w:r>
+        <w:rPr>
+          <w:highlight w:val="green"/>
+          <w:lang w:val="en-US"/>
+        </w:rPr>
+        <w:t xml:space="preserve"> </w:t>
+      </w:r>
+      <w:r>
+        <w:rPr>
+          <w:highlight w:val="green"/>
+          <w:lang w:val="en-US"/>
+        </w:rPr>
+        <w:t>Done</w:t>
+      </w:r>
     </w:p>
     <w:p>
       <w:pPr>
@@ -1779,7 +1951,35 @@
         <w:rPr>
           <w:lang w:val="en-US"/>
         </w:rPr>
-        <w:t>Add textlist results as well for BS.</w:t>
+        <w:t xml:space="preserve">Add </w:t>
+      </w:r>
+      <w:proofErr w:type="spellStart"/>
+      <w:r>
+        <w:rPr>
+          <w:lang w:val="en-US"/>
+        </w:rPr>
+        <w:t>textlist</w:t>
+      </w:r>
+      <w:proofErr w:type="spellEnd"/>
+      <w:r>
+        <w:rPr>
+          <w:lang w:val="en-US"/>
+        </w:rPr>
+        <w:t xml:space="preserve"> results as well for BS.</w:t>
+      </w:r>
+      <w:r>
+        <w:rPr>
+          <w:highlight w:val="green"/>
+          <w:lang w:val="en-US"/>
+        </w:rPr>
+        <w:t xml:space="preserve"> </w:t>
+      </w:r>
+      <w:r>
+        <w:rPr>
+          <w:highlight w:val="green"/>
+          <w:lang w:val="en-US"/>
+        </w:rPr>
+        <w:t>Done</w:t>
       </w:r>
     </w:p>
     <w:p>
@@ -3470,6 +3670,7 @@
   <w:style w:type="character" w:default="1" w:styleId="DefaultParagraphFont">
     <w:name w:val="Default Paragraph Font"/>
     <w:uiPriority w:val="1"/>
+    <w:semiHidden/>
     <w:unhideWhenUsed/>
   </w:style>
   <w:style w:type="table" w:default="1" w:styleId="TableNormal">

</xml_diff>

<commit_message>
added comments in the PM review doc
added comments in the PM review doc
</commit_message>
<xml_diff>
--- a/_dev/Feedback/Internal/Observations_BTS BD Sim_SV_19-Oct 2026.docx
+++ b/_dev/Feedback/Internal/Observations_BTS BD Sim_SV_19-Oct 2026.docx
@@ -26,7 +26,6 @@
         </w:rPr>
         <w:t xml:space="preserve">(vertically) </w:t>
       </w:r>
-      <w:proofErr w:type="spellStart"/>
       <w:r>
         <w:rPr>
           <w:lang w:val="en-US"/>
@@ -40,7 +39,6 @@
         </w:rPr>
         <w:t>Done</w:t>
       </w:r>
-      <w:proofErr w:type="spellEnd"/>
     </w:p>
     <w:p>
       <w:pPr>
@@ -439,14 +437,7 @@
           <w:lang w:val="en-US"/>
         </w:rPr>
         <w:lastRenderedPageBreak/>
-        <w:t xml:space="preserve">Is this faded effect </w:t>
-      </w:r>
-      <w:proofErr w:type="spellStart"/>
-      <w:r>
-        <w:rPr>
-          <w:lang w:val="en-US"/>
-        </w:rPr>
-        <w:t>intentional?</w:t>
+        <w:t>Is this faded effect intentional?</w:t>
       </w:r>
       <w:r>
         <w:rPr>
@@ -455,7 +446,6 @@
         </w:rPr>
         <w:t>Done</w:t>
       </w:r>
-      <w:proofErr w:type="spellEnd"/>
     </w:p>
     <w:p>
       <w:pPr>
@@ -755,6 +745,19 @@
         <w:lastRenderedPageBreak/>
         <w:t>Please change the images at least!</w:t>
       </w:r>
+      <w:r>
+        <w:rPr>
+          <w:lang w:val="en-US"/>
+        </w:rPr>
+        <w:t xml:space="preserve"> </w:t>
+      </w:r>
+      <w:r>
+        <w:rPr>
+          <w:highlight w:val="green"/>
+          <w:lang w:val="en-US"/>
+        </w:rPr>
+        <w:t>Done</w:t>
+      </w:r>
     </w:p>
     <w:p>
       <w:pPr>
@@ -879,21 +882,7 @@
           <w:lang w:val="en-US"/>
         </w:rPr>
         <w:lastRenderedPageBreak/>
-        <w:t xml:space="preserve">Font </w:t>
-      </w:r>
-      <w:proofErr w:type="spellStart"/>
-      <w:r>
-        <w:rPr>
-          <w:lang w:val="en-US"/>
-        </w:rPr>
-        <w:t>colour</w:t>
-      </w:r>
-      <w:proofErr w:type="spellEnd"/>
-      <w:r>
-        <w:rPr>
-          <w:lang w:val="en-US"/>
-        </w:rPr>
-        <w:t xml:space="preserve"> of F login is too light.</w:t>
+        <w:t>Font colour of F login is too light.</w:t>
       </w:r>
       <w:r>
         <w:rPr>
@@ -1121,23 +1110,7 @@
           <w:highlight w:val="yellow"/>
           <w:lang w:val="en-US"/>
         </w:rPr>
-        <w:t xml:space="preserve"> </w:t>
-      </w:r>
-      <w:proofErr w:type="spellStart"/>
-      <w:r>
-        <w:rPr>
-          <w:highlight w:val="yellow"/>
-          <w:lang w:val="en-US"/>
-        </w:rPr>
-        <w:t>its</w:t>
-      </w:r>
-      <w:proofErr w:type="spellEnd"/>
-      <w:r>
-        <w:rPr>
-          <w:highlight w:val="yellow"/>
-          <w:lang w:val="en-US"/>
-        </w:rPr>
-        <w:t xml:space="preserve"> as per design</w:t>
+        <w:t xml:space="preserve"> its as per design</w:t>
       </w:r>
     </w:p>
     <w:p>
@@ -1422,6 +1395,20 @@
         <w:lastRenderedPageBreak/>
         <w:t>Reduce this white space as much as we can.</w:t>
       </w:r>
+      <w:r>
+        <w:rPr>
+          <w:highlight w:val="green"/>
+          <w:lang w:val="en-US"/>
+        </w:rPr>
+        <w:t xml:space="preserve"> </w:t>
+      </w:r>
+      <w:r>
+        <w:rPr>
+          <w:highlight w:val="green"/>
+          <w:lang w:val="en-US"/>
+        </w:rPr>
+        <w:t>Done</w:t>
+      </w:r>
     </w:p>
     <w:p>
       <w:pPr>
@@ -1993,21 +1980,7 @@
         <w:rPr>
           <w:lang w:val="en-US"/>
         </w:rPr>
-        <w:t xml:space="preserve">Add </w:t>
-      </w:r>
-      <w:proofErr w:type="spellStart"/>
-      <w:r>
-        <w:rPr>
-          <w:lang w:val="en-US"/>
-        </w:rPr>
-        <w:t>textlist</w:t>
-      </w:r>
-      <w:proofErr w:type="spellEnd"/>
-      <w:r>
-        <w:rPr>
-          <w:lang w:val="en-US"/>
-        </w:rPr>
-        <w:t xml:space="preserve"> results as well for BS.</w:t>
+        <w:t>Add textlist results as well for BS.</w:t>
       </w:r>
       <w:r>
         <w:rPr>

</xml_diff>